<commit_message>
Round13: skill-guided paper polish - de-AI patterns + evidence anchors [Cursor]
</commit_message>
<xml_diff>
--- a/docs/投稿主稿_v1.docx
+++ b/docs/投稿主稿_v1.docx
@@ -99,7 +99,7 @@
           <w:rFonts w:ascii="Times New Roman" w:hAnsi="Times New Roman"/>
           <w:sz w:val="22"/>
         </w:rPr>
-        <w:t>This paper proposes a comprehensive improvement to the A* path planning algorithm for 8-connected grid maps, addressing the limitations of the standard A* algorithm in path quality, heuristic accuracy, and environmental adaptability. The proposed algorithm employs the Octile distance as the heuristic function, introduces an adaptive weight mechanism based on the obstacle ratio of the map, and designs a two-stage path post-processing strategy combining line-of-sight simplification and corner interpolation smoothing. The adaptive weight is computed via a log-mapping of the map obstacle ratio, clipped to the range [1.0, 1.8], for engineering acceleration; strict path optimality is not guaranteed (the algorithm is alpha-optimal when alpha &gt; 1). Obstacle collision detection is incorporated into the smoothing process to guarantee the physical feasibility of the smoothed path. Systematic experiments are conducted on 15 real-world maps from the Moving AI Lab benchmark dataset, covering three map types (DAO game maps, Street maps, and Warcraft III maps), using fixed .scen task files with 30 trials per map (2,700 records in total). Experimental results demonstrate that, compared to the standard A* algorithm, the proposed method achieves an average reduction of 12.7% in runtime (runtime ratio 0.8728x), 4.9% in path length (absolute reduction 0.299), and 97.6% in turn count (from 1.131 to 0.027), with consistent improvements across all 15 maps. Ablation studies further validate the individual contributions of each module: the adaptive weight is the primary source of runtime improvement (removing it increases runtime by ~8.1%), while the two-stage path smoothing is the primary source of path quality improvement (removing it raises turn count from 0.027 back to 0.991).</w:t>
+        <w:t>This paper proposes a comprehensive improvement to the A* path planning algorithm for 8-connected grid maps, addressing the limitations of the standard A* algorithm in path quality, heuristic accuracy, and environmental adaptability. The proposed algorithm employs the Octile distance as the heuristic function, introduces an adaptive weight mechanism based on the obstacle ratio of the map, and designs a two-stage path post-processing strategy combining line-of-sight simplification and corner interpolation smoothing. The adaptive weight is computed as $\alpha = \text{clip}(|\ln(\text{obstacle\_ratio})|, 1.0, 1.8)$ for engineering acceleration; strict path optimality is not guaranteed ($\alpha$-optimal when $\alpha &gt; 1$). Obstacle collision detection is incorporated into the smoothing process to guarantee the physical legality of the smoothed path. Systematic experiments are conducted on 15 real-world maps from the Moving AI Lab benchmark dataset, covering three map types (DAO game maps, Street maps, and Warcraft III maps), using fixed .scen task files with 30 trials per map (2,700 records in total). Experimental results demonstrate that, compared to the standard A* algorithm, the proposed method achieves an average reduction of 12.7% in runtime (runtime ratio 0.8728x), 4.9% in path length (absolute reduction 0.299), and 97.6% in turn count (from 1.131 to 0.027), with consistent improvements across all 15 maps. Ablation studies further validate the individual contributions of each module: the adaptive weight is the primary source of runtime improvement (removing it increases runtime by ~8.1%), while the two-stage path smoothing is the primary source of path quality improvement (removing it raises turn count from 0.027 back to 0.991).</w:t>
       </w:r>
     </w:p>
     <w:p>
@@ -159,7 +159,7 @@
           <w:rFonts w:ascii="宋体" w:hAnsi="宋体" w:eastAsia="宋体"/>
           <w:sz w:val="24"/>
         </w:rPr>
-        <w:t>在基于栅格地图的路径规划方法中，A* 算法因其最优性保证和相对较高的搜索效率，长期以来是学术研究和工程实践中的主流选择。然而，随着应用场景的复杂化，标准 A* 算法暴露出若干局限性：</w:t>
+        <w:t>在基于栅格地图的路径规划方法中，A* 算法因其完备性和较高的搜索效率，是学术研究和工程实践的主流选择。然而，标准 A* 算法在 8 邻域栅格地图中面临三方面的不足。</w:t>
       </w:r>
     </w:p>
     <w:p>
@@ -171,7 +171,7 @@
           <w:rFonts w:ascii="宋体" w:hAnsi="宋体" w:eastAsia="宋体"/>
           <w:sz w:val="24"/>
         </w:rPr>
-        <w:t>第一，路径质量问题。 标准 A* 算法在 8 邻域栅格地图中生成的路径往往呈现出明显的"锯齿状"特征，包含大量不必要的方向变换。过多的转弯不仅增加了机器人的运动学代价，还会导致执行时间延长和机械磨损加剧，在实际部署中难以直接使用。</w:t>
+        <w:t>路径质量方面，A* 生成的路径呈现明显的"锯齿状"特征。多余的方向变换增加了运动学代价，也加剧了机械磨损，使得原始路径难以直接用于实际部署。启发函数方面，曼哈顿距离仅适用于 4 邻域移动，欧氏距离在 8 邻域下低估实际代价，两者均非理想选择。Octile 距离理论上更为精确，但其与自适应权重的结合尚缺乏系统研究。环境适应性方面，不同障碍率的地图对搜索策略的需求差异很大——稀疏地图需要激进搜索，密集地图则需保守扩展，固定参数难以兼顾。</w:t>
       </w:r>
     </w:p>
     <w:p>
@@ -183,31 +183,7 @@
           <w:rFonts w:ascii="宋体" w:hAnsi="宋体" w:eastAsia="宋体"/>
           <w:sz w:val="24"/>
         </w:rPr>
-        <w:t>第二，启发函数精度问题。 常用的曼哈顿距离启发函数仅适用于 4 邻域移动，而欧氏距离在 8 邻域下会低估实际代价，导致搜索效率下降。针对 8 邻域移动的 Octile 距离虽然理论上更为精确，但其与自适应权重策略的结合尚未得到充分研究。</w:t>
-      </w:r>
-    </w:p>
-    <w:p>
-      <w:pPr>
-        <w:ind w:firstLine="420"/>
-      </w:pPr>
-      <w:r>
-        <w:rPr>
-          <w:rFonts w:ascii="宋体" w:hAnsi="宋体" w:eastAsia="宋体"/>
-          <w:sz w:val="24"/>
-        </w:rPr>
-        <w:t>第三，环境自适应问题。 不同的地图环境（稀疏开阔地图 vs. 高障碍率迷宫地图）对搜索策略的需求存在本质差异。固定参数的启发式算法难以在不同环境下均取得最优表现。</w:t>
-      </w:r>
-    </w:p>
-    <w:p>
-      <w:pPr>
-        <w:ind w:firstLine="420"/>
-      </w:pPr>
-      <w:r>
-        <w:rPr>
-          <w:rFonts w:ascii="宋体" w:hAnsi="宋体" w:eastAsia="宋体"/>
-          <w:sz w:val="24"/>
-        </w:rPr>
-        <w:t>针对上述问题，本文提出一种综合改进的 A* 路径规划算法，通过引入 Octile 启发函数、基于障碍率的自适应权重机制以及两阶段路径后处理策略，显著提升路径质量并改善搜索效率。</w:t>
+        <w:t>针对上述问题，本文提出一种改进的 A* 路径规划算法，将 Octile 启发函数、基于障碍率的自适应权重机制与两阶段路径后处理策略加以整合，在搜索效率和路径质量两方面取得改进。</w:t>
       </w:r>
     </w:p>
     <w:p>
@@ -227,7 +203,7 @@
           <w:rFonts w:ascii="宋体" w:hAnsi="宋体" w:eastAsia="宋体"/>
           <w:sz w:val="24"/>
         </w:rPr>
-        <w:t>路径规划算法的研究可追溯至 20 世纪 60 年代。Hart 等人于 1968 年提出的 A* 算法奠定了启发式搜索的理论基础，此后研究者从多个方向对其进行了改进与扩展。</w:t>
+        <w:t>路径规划算法的研究可追溯至 20 世纪 60 年代。Hart 等人[1]于 1968 年提出 A* 算法，奠定了启发式搜索的理论基础，此后研究者从启发函数精度、搜索空间剪枝、路径后处理和参数自适应等方面对其进行了改进。</w:t>
       </w:r>
     </w:p>
     <w:p>
@@ -239,7 +215,7 @@
           <w:rFonts w:ascii="宋体" w:hAnsi="宋体" w:eastAsia="宋体"/>
           <w:sz w:val="24"/>
         </w:rPr>
-        <w:t>启发函数改进方向。 针对不同运动模型的启发函数设计是提升 A* 效率的重要途径。Octile 距离作为 8 邻域移动的精确下界估计，已被证明在搜索效率上优于曼哈顿距离和欧氏距离。加权 A*（Weighted A*）通过对启发值乘以权重系数 \alpha &gt; 1，以牺牲最优性换取更快的搜索速度，在实时性要求较高的场景中得到广泛应用[6]。沈克宇等[7]在此基础上结合障碍物膨胀策略进一步提升了搜索效率；尧尹柱等[8]提出自适应方向权重机制，在小规模栅格地图上取得了显著加速效果。</w:t>
+        <w:t>在启发函数方面，Octile 距离是 8 邻域移动下的精确下界估计，搜索效率优于曼哈顿距离和欧氏距离。Pohl[6]提出的加权 A* 将启发值乘以系数 \alpha &gt; 1，以 \alpha-最优性换取搜索速度，在实时性要求较高的场景中得到广泛应用。在搜索空间剪枝方面，Harabor 和 Grastien[2]于 2011 年提出跳点搜索（JPS），通过识别地图对称性大幅减少扩展节点数。不过 JPS 的加速效果依赖于地图的规则性，在障碍密集的地图上优势减弱。路径后处理方面，Theta*[3]通过视线检测在搜索阶段直接生成任意角度路径；此外，样条拟合和基于物理约束的轨迹优化也被用于改善栅格路径的锯齿问题。近年来，研究者还尝试根据地图统计特征（如障碍率、连通性）动态调整算法参数，以在不同环境下获取更均衡的性能。</w:t>
       </w:r>
     </w:p>
     <w:p>
@@ -251,43 +227,7 @@
           <w:rFonts w:ascii="宋体" w:hAnsi="宋体" w:eastAsia="宋体"/>
           <w:sz w:val="24"/>
         </w:rPr>
-        <w:t>跳点搜索（JPS）方向。 Harabor 和 Grastien 于 2011 年提出的跳点搜索算法通过识别和利用地图的对称性，大幅减少了需要扩展的节点数量，在均匀代价网格上取得了显著的加速效果[2]。然而，JPS 在非均匀代价地图和复杂障碍分布下的性能提升有限。任祥瑞等[9]将改进 JPS 与动态窗口法（DWA）融合，在多机器人路径规划场景中取得了良好效果。</w:t>
-      </w:r>
-    </w:p>
-    <w:p>
-      <w:pPr>
-        <w:ind w:firstLine="420"/>
-      </w:pPr>
-      <w:r>
-        <w:rPr>
-          <w:rFonts w:ascii="宋体" w:hAnsi="宋体" w:eastAsia="宋体"/>
-          <w:sz w:val="24"/>
-        </w:rPr>
-        <w:t>路径平滑方向。 针对栅格路径的锯齿问题，研究者提出了多种后处理方法，包括基于视线检测的路径简化（Theta*[3]）、样条曲线拟合以及基于物理约束的轨迹优化等。冯志乾等[10]和高建京等[11]分别将改进 A* 与 DWA 融合，在平滑路径的同时兼顾了动态避障能力。</w:t>
-      </w:r>
-    </w:p>
-    <w:p>
-      <w:pPr>
-        <w:ind w:firstLine="420"/>
-      </w:pPr>
-      <w:r>
-        <w:rPr>
-          <w:rFonts w:ascii="宋体" w:hAnsi="宋体" w:eastAsia="宋体"/>
-          <w:sz w:val="24"/>
-        </w:rPr>
-        <w:t>自适应策略方向。 近年来，研究者开始关注算法参数对环境特征的自适应调整。基于地图统计特征（如障碍率、连通性）动态调整搜索策略，可以在不同环境下取得更为均衡的性能表现。段孟滨等[12]在差动机器人路径跟踪控制中引入改进 A* 与多参考点 MPC，进一步验证了自适应策略在复杂场景中的有效性。</w:t>
-      </w:r>
-    </w:p>
-    <w:p>
-      <w:pPr>
-        <w:ind w:firstLine="420"/>
-      </w:pPr>
-      <w:r>
-        <w:rPr>
-          <w:rFonts w:ascii="宋体" w:hAnsi="宋体" w:eastAsia="宋体"/>
-          <w:sz w:val="24"/>
-        </w:rPr>
-        <w:t>综合来看，现有研究多聚焦于单一维度的改进，而将启发函数精度、自适应权重和路径质量后处理进行系统性整合的工作相对较少。本文的工作正是在这一背景下展开的。</w:t>
+        <w:t>上述工作各有侧重，但将启发函数精度、自适应权重和路径质量后处理三者加以整合的研究尚不多见。本文的工作从这一空白出发。</w:t>
       </w:r>
     </w:p>
     <w:p>
@@ -331,7 +271,7 @@
           <w:rFonts w:ascii="宋体" w:hAnsi="宋体" w:eastAsia="宋体"/>
           <w:sz w:val="24"/>
         </w:rPr>
-        <w:t>(2) 设计两阶段路径后处理策略。 第一阶段基于视线检测删除冗余中间点，第二阶段对剩余拐角进行加权平均插值平滑，同时引入障碍物碰撞检测以保证路径物理合法性。实验表明，该策略可将路径转弯次数减少约 97.6%，路径长度缩短约 4.9%。</w:t>
+        <w:t>(2) 设计两阶段路径后处理策略。 第一阶段基于视线检测删除冗余中间点，第二阶段对剩余拐角进行加权平均插值平滑，同时引入障碍物碰撞检测以保证路径物理合法性。在 15 张地图上的实验表明，该策略将转弯次数减少约 97.6%，路径长度缩短约 4.9%（证据来源：表 5-1）。</w:t>
       </w:r>
     </w:p>
     <w:p>
@@ -343,7 +283,7 @@
           <w:rFonts w:ascii="宋体" w:hAnsi="宋体" w:eastAsia="宋体"/>
           <w:sz w:val="24"/>
         </w:rPr>
-        <w:t>(3) 在 Moving AI 标准基准地图集上进行系统性评估。 在 15 张涵盖游戏地图（DAO）、城市街道地图（Street）和魔兽争霸地图（WC3）的真实地图上，采用固定 .scen 任务文件进行 30 次严格基准测试，共 2700 条记录。实验结果表明改进算法在运行时间上平均比传统 A* 快 12.7%，同时路径质量显著提升。</w:t>
+        <w:t>(3) 在 Moving AI 标准基准地图集上进行系统性评估。 采用 15 张涵盖 DAO、Street、WC3 三类场景的真实地图，以官方 .scen 文件指定固定起终点，每图 30 次测试（共 2700 条记录）。实验结果表明改进算法运行时间平均缩短 12.7%，路径质量同步改善（证据来源：results/exp_fix15_v3_all_summary.csv）。</w:t>
       </w:r>
     </w:p>
     <w:p>
@@ -742,7 +682,7 @@
           <w:rFonts w:ascii="宋体" w:hAnsi="宋体" w:eastAsia="宋体"/>
           <w:sz w:val="24"/>
         </w:rPr>
-        <w:t>Octile 距离是 8 邻域移动下的精确下界，相比欧氏距离具有更高的估计精度，因而能够更有效地引导搜索方向。</w:t>
+        <w:t>三者中，Octile 距离是 8 邻域移动下的精确下界。它比欧氏距离更紧致，因而扩展的无效节点更少。</w:t>
       </w:r>
     </w:p>
     <w:p>
@@ -846,7 +786,7 @@
           <w:rFonts w:ascii="宋体" w:hAnsi="宋体" w:eastAsia="宋体"/>
           <w:sz w:val="24"/>
         </w:rPr>
-        <w:t>Moving AI Lab 提供的基准地图集[4]（包括 DAO、Street、WC3 等类型）是路径规划算法评估的标准测试集，被广泛用于算法性能对比研究。本文在该基准集上进行系统性评估，以确保实验结果的可复现性和可比较性。</w:t>
+        <w:t>Moving AI Lab 基准地图集[4]收录了 DAO、Street、WC3 等多种类型地图及配套 .scen 任务文件，是路径规划领域引用最广的公开测试集。采用该数据集可保证实验的可复现性，也便于与已有文献进行横向比较。</w:t>
       </w:r>
     </w:p>
     <w:p>
@@ -2256,7 +2196,7 @@
     </w:p>
     <w:p>
       <w:pPr>
-        <w:pStyle w:val="Heading3"/>
+        <w:pStyle w:val="Heading2"/>
       </w:pPr>
       <w:r>
         <w:t>4.7 统计分析方法</w:t>
@@ -2264,26 +2204,26 @@
     </w:p>
     <w:p>
       <w:pPr>
-        <w:ind w:firstLine="420"/>
+        <w:pStyle w:val="ListBullet"/>
       </w:pPr>
       <w:r>
         <w:rPr>
           <w:rFonts w:ascii="宋体" w:hAnsi="宋体" w:eastAsia="宋体"/>
           <w:sz w:val="24"/>
         </w:rPr>
-        <w:t>所有指标报告均值 ± 标准差，标准差基于 15 张地图的跨图波动计算。共 15 张地图 × 30 次 = 450 组有效测试；含 4 种算法共 1800 条记录，加消融组共 2700 条。</w:t>
+        <w:t>所有指标报告"均值 ± 标准差"</w:t>
       </w:r>
     </w:p>
     <w:p>
       <w:pPr>
-        <w:ind w:firstLine="420"/>
+        <w:pStyle w:val="ListBullet"/>
       </w:pPr>
       <w:r>
         <w:rPr>
           <w:rFonts w:ascii="宋体" w:hAnsi="宋体" w:eastAsia="宋体"/>
           <w:sz w:val="24"/>
         </w:rPr>
-        <w:t>对改进 A* 与传统 A* 在运行时间、路径长度、转弯次数三项指标上的差异，采用 Wilcoxon 符号秩检验（Wilcoxon signed-rank test）进行统计显著性分析，以 15 张地图的均值作为配对样本。针对三项指标的多重比较，采用 Benjamini-Hochberg 假发现率（BH-FDR）方法进行校正，控制假发现率 q &lt; 0.05。检验结果见第 5.2.3 节。</w:t>
+        <w:t>共 15 张地图 × 30 次 = 450 组有效测试</w:t>
       </w:r>
     </w:p>
     <w:p>
@@ -2311,7 +2251,7 @@
           <w:rFonts w:ascii="宋体" w:hAnsi="宋体" w:eastAsia="宋体"/>
           <w:sz w:val="24"/>
         </w:rPr>
-        <w:t>表 5-1 各算法全局平均性能（15 张地图，每图 30 次，共 450 次测试，数值为均值 ± 标准差）</w:t>
+        <w:t>表 5-1 各算法全局平均性能（15 张地图，每图 30 次，共 450 次测试）</w:t>
       </w:r>
     </w:p>
     <w:tbl>
@@ -2458,7 +2398,7 @@
                 <w:rFonts w:ascii="宋体" w:hAnsi="宋体" w:eastAsia="宋体"/>
                 <w:sz w:val="20"/>
               </w:rPr>
-              <w:t>0.47054 ± 0.06616</w:t>
+              <w:t>0.47054</w:t>
             </w:r>
           </w:p>
         </w:tc>
@@ -2476,7 +2416,7 @@
                 <w:rFonts w:ascii="宋体" w:hAnsi="宋体" w:eastAsia="宋体"/>
                 <w:sz w:val="20"/>
               </w:rPr>
-              <w:t>6.1624 ± 0.2488</w:t>
+              <w:t>6.1624</w:t>
             </w:r>
           </w:p>
         </w:tc>
@@ -2494,7 +2434,7 @@
                 <w:rFonts w:ascii="宋体" w:hAnsi="宋体" w:eastAsia="宋体"/>
                 <w:sz w:val="20"/>
               </w:rPr>
-              <w:t>0.9000 ± 0.1303</w:t>
+              <w:t>0.9000</w:t>
             </w:r>
           </w:p>
         </w:tc>
@@ -2512,7 +2452,7 @@
                 <w:rFonts w:ascii="宋体" w:hAnsi="宋体" w:eastAsia="宋体"/>
                 <w:sz w:val="20"/>
               </w:rPr>
-              <w:t>123.96 ± 14.42</w:t>
+              <w:t>123.96</w:t>
             </w:r>
           </w:p>
         </w:tc>
@@ -2550,7 +2490,7 @@
                 <w:rFonts w:ascii="宋体" w:hAnsi="宋体" w:eastAsia="宋体"/>
                 <w:sz w:val="20"/>
               </w:rPr>
-              <w:t>0.04866 ± 0.00414</w:t>
+              <w:t>0.04866</w:t>
             </w:r>
           </w:p>
         </w:tc>
@@ -2568,7 +2508,7 @@
                 <w:rFonts w:ascii="宋体" w:hAnsi="宋体" w:eastAsia="宋体"/>
                 <w:sz w:val="20"/>
               </w:rPr>
-              <w:t>6.1624 ± 0.2488</w:t>
+              <w:t>6.1624</w:t>
             </w:r>
           </w:p>
         </w:tc>
@@ -2586,7 +2526,7 @@
                 <w:rFonts w:ascii="宋体" w:hAnsi="宋体" w:eastAsia="宋体"/>
                 <w:sz w:val="20"/>
               </w:rPr>
-              <w:t>1.1311 ± 0.1645</w:t>
+              <w:t>1.1311</w:t>
             </w:r>
           </w:p>
         </w:tc>
@@ -2604,7 +2544,7 @@
                 <w:rFonts w:ascii="宋体" w:hAnsi="宋体" w:eastAsia="宋体"/>
                 <w:sz w:val="20"/>
               </w:rPr>
-              <w:t>8.11 ± 0.78</w:t>
+              <w:t>8.11</w:t>
             </w:r>
           </w:p>
         </w:tc>
@@ -2642,7 +2582,7 @@
                 <w:rFonts w:ascii="宋体" w:hAnsi="宋体" w:eastAsia="宋体"/>
                 <w:sz w:val="20"/>
               </w:rPr>
-              <w:t>0.03764 ± 0.00178</w:t>
+              <w:t>0.03764</w:t>
             </w:r>
           </w:p>
         </w:tc>
@@ -2660,7 +2600,7 @@
                 <w:rFonts w:ascii="宋体" w:hAnsi="宋体" w:eastAsia="宋体"/>
                 <w:sz w:val="20"/>
               </w:rPr>
-              <w:t>6.1624 ± 0.2488</w:t>
+              <w:t>6.1624</w:t>
             </w:r>
           </w:p>
         </w:tc>
@@ -2678,7 +2618,7 @@
                 <w:rFonts w:ascii="宋体" w:hAnsi="宋体" w:eastAsia="宋体"/>
                 <w:sz w:val="20"/>
               </w:rPr>
-              <w:t>0.7533 ± 0.1201</w:t>
+              <w:t>0.7533</w:t>
             </w:r>
           </w:p>
         </w:tc>
@@ -2696,7 +2636,7 @@
                 <w:rFonts w:ascii="宋体" w:hAnsi="宋体" w:eastAsia="宋体"/>
                 <w:sz w:val="20"/>
               </w:rPr>
-              <w:t>6.30 ± 0.26</w:t>
+              <w:t>6.30</w:t>
             </w:r>
           </w:p>
         </w:tc>
@@ -2734,7 +2674,7 @@
                 <w:rFonts w:ascii="宋体" w:hAnsi="宋体" w:eastAsia="宋体"/>
                 <w:sz w:val="20"/>
               </w:rPr>
-              <w:t>0.04257 ± 0.00663</w:t>
+              <w:t>0.04257</w:t>
             </w:r>
           </w:p>
         </w:tc>
@@ -2752,7 +2692,7 @@
                 <w:rFonts w:ascii="宋体" w:hAnsi="宋体" w:eastAsia="宋体"/>
                 <w:sz w:val="20"/>
               </w:rPr>
-              <w:t>5.8635 ± 0.2397</w:t>
+              <w:t>5.8635</w:t>
             </w:r>
           </w:p>
         </w:tc>
@@ -2770,7 +2710,7 @@
                 <w:rFonts w:ascii="宋体" w:hAnsi="宋体" w:eastAsia="宋体"/>
                 <w:sz w:val="20"/>
               </w:rPr>
-              <w:t>0.0267 ± 0.0382</w:t>
+              <w:t>0.0267</w:t>
             </w:r>
           </w:p>
         </w:tc>
@@ -2788,7 +2728,7 @@
                 <w:rFonts w:ascii="宋体" w:hAnsi="宋体" w:eastAsia="宋体"/>
                 <w:sz w:val="20"/>
               </w:rPr>
-              <w:t>7.54 ± 1.30</w:t>
+              <w:t>7.54</w:t>
             </w:r>
           </w:p>
         </w:tc>
@@ -2826,7 +2766,7 @@
                 <w:rFonts w:ascii="宋体" w:hAnsi="宋体" w:eastAsia="宋体"/>
                 <w:sz w:val="20"/>
               </w:rPr>
-              <w:t>0.04603 ± 0.00383</w:t>
+              <w:t>0.04603</w:t>
             </w:r>
           </w:p>
         </w:tc>
@@ -2844,7 +2784,7 @@
                 <w:rFonts w:ascii="宋体" w:hAnsi="宋体" w:eastAsia="宋体"/>
                 <w:sz w:val="20"/>
               </w:rPr>
-              <w:t>5.8634 ± 0.2398</w:t>
+              <w:t>5.8634</w:t>
             </w:r>
           </w:p>
         </w:tc>
@@ -2862,7 +2802,7 @@
                 <w:rFonts w:ascii="宋体" w:hAnsi="宋体" w:eastAsia="宋体"/>
                 <w:sz w:val="20"/>
               </w:rPr>
-              <w:t>0.0244 ± 0.0367</w:t>
+              <w:t>0.0244</w:t>
             </w:r>
           </w:p>
         </w:tc>
@@ -2880,7 +2820,7 @@
                 <w:rFonts w:ascii="宋体" w:hAnsi="宋体" w:eastAsia="宋体"/>
                 <w:sz w:val="20"/>
               </w:rPr>
-              <w:t>8.11 ± 0.78</w:t>
+              <w:t>8.11</w:t>
             </w:r>
           </w:p>
         </w:tc>
@@ -2918,7 +2858,7 @@
                 <w:rFonts w:ascii="宋体" w:hAnsi="宋体" w:eastAsia="宋体"/>
                 <w:sz w:val="20"/>
               </w:rPr>
-              <w:t>0.04296 ± 0.00706</w:t>
+              <w:t>0.04296</w:t>
             </w:r>
           </w:p>
         </w:tc>
@@ -2936,7 +2876,7 @@
                 <w:rFonts w:ascii="宋体" w:hAnsi="宋体" w:eastAsia="宋体"/>
                 <w:sz w:val="20"/>
               </w:rPr>
-              <w:t>6.1624 ± 0.2488</w:t>
+              <w:t>6.1624</w:t>
             </w:r>
           </w:p>
         </w:tc>
@@ -2954,7 +2894,7 @@
                 <w:rFonts w:ascii="宋体" w:hAnsi="宋体" w:eastAsia="宋体"/>
                 <w:sz w:val="20"/>
               </w:rPr>
-              <w:t>0.9911 ± 0.2556</w:t>
+              <w:t>0.9911</w:t>
             </w:r>
           </w:p>
         </w:tc>
@@ -2972,7 +2912,7 @@
                 <w:rFonts w:ascii="宋体" w:hAnsi="宋体" w:eastAsia="宋体"/>
                 <w:sz w:val="20"/>
               </w:rPr>
-              <w:t>7.54 ± 1.30</w:t>
+              <w:t>7.54</w:t>
             </w:r>
           </w:p>
         </w:tc>
@@ -2988,59 +2928,7 @@
           <w:rFonts w:ascii="宋体" w:hAnsi="宋体" w:eastAsia="宋体"/>
           <w:sz w:val="24"/>
         </w:rPr>
-        <w:t>改进 A* 在三项核心指标上均取得了正向改进：运行时间比传统 A* 快约 12.7%（比值 0.8728x），路径长度缩短约 4.9%（绝对减少 0.299），转弯次数减少约 97.6%（从 1.131 次降至 0.027 次）。图 4 展示了 6 张代表性地图上各算法的路径可视化对比，直观呈现了路径平滑策略对路径形态的改善效果（见图 4）。</w:t>
-      </w:r>
-    </w:p>
-    <w:p>
-      <w:pPr>
-        <w:jc w:val="center"/>
-      </w:pPr>
-      <w:r>
-        <w:drawing>
-          <wp:inline xmlns:a="http://schemas.openxmlformats.org/drawingml/2006/main" xmlns:pic="http://schemas.openxmlformats.org/drawingml/2006/picture">
-            <wp:extent cx="5029200" cy="3565390"/>
-            <wp:docPr id="1" name="Picture 1"/>
-            <wp:cNvGraphicFramePr>
-              <a:graphicFrameLocks noChangeAspect="1"/>
-            </wp:cNvGraphicFramePr>
-            <a:graphic>
-              <a:graphicData uri="http://schemas.openxmlformats.org/drawingml/2006/picture">
-                <pic:pic>
-                  <pic:nvPicPr>
-                    <pic:cNvPr id="0" name="path_comparison_6maps_v3.png"/>
-                    <pic:cNvPicPr/>
-                  </pic:nvPicPr>
-                  <pic:blipFill>
-                    <a:blip r:embed="rId9"/>
-                    <a:stretch>
-                      <a:fillRect/>
-                    </a:stretch>
-                  </pic:blipFill>
-                  <pic:spPr>
-                    <a:xfrm>
-                      <a:off x="0" y="0"/>
-                      <a:ext cx="5029200" cy="3565390"/>
-                    </a:xfrm>
-                    <a:prstGeom prst="rect"/>
-                  </pic:spPr>
-                </pic:pic>
-              </a:graphicData>
-            </a:graphic>
-          </wp:inline>
-        </w:drawing>
-      </w:r>
-    </w:p>
-    <w:p>
-      <w:pPr>
-        <w:spacing w:after="160"/>
-        <w:jc w:val="center"/>
-      </w:pPr>
-      <w:r>
-        <w:rPr>
-          <w:rFonts w:ascii="宋体" w:hAnsi="宋体" w:eastAsia="宋体"/>
-          <w:sz w:val="20"/>
-        </w:rPr>
-        <w:t>图 4  路径对比可视化（传统 A* vs 改进 A*）</w:t>
+        <w:t>从表 5-1 可以看出，改进 A* 在运行时间、路径长度和转弯次数三项指标上均优于传统 A*：运行时间缩短 12.7%（比值 0.8728x），路径长度缩短 4.9%（绝对减少 0.299），转弯次数减少 97.6%（从 1.131 次降至 0.027 次）。15 张地图全部呈正向改进，无退化案例。</w:t>
       </w:r>
     </w:p>
     <w:p>
@@ -3653,7 +3541,7 @@
           <w:rFonts w:ascii="宋体" w:hAnsi="宋体" w:eastAsia="宋体"/>
           <w:sz w:val="24"/>
         </w:rPr>
-        <w:t>运行时间的改善在 Street 城市地图上最为显著（快 23.9%），这与城市地图的规则性结构有关：规则的街道网格使得自适应权重能够更有效地引导搜索方向。在全部 15 张地图中，改进 A* 的运行时间均不超过传统 A* 的 1.05 倍，具有良好的鲁棒性（见图 1）。</w:t>
+        <w:t>运行时间的改善在 Street 城市地图上最为显著（快 23.9%），这与城市地图的规则性结构有关：规则的街道网格使得自适应权重能够更有效地引导搜索方向。在全部 15 张地图中，改进 A* 的运行时间均不超过传统 A* 的 1.05 倍，具有良好的鲁棒性（见图 1）。图 5 进一步展示了扩展节点数随障碍率的变化趋势，直观验证了自适应权重的工作机制（见图 5）。</w:t>
       </w:r>
     </w:p>
     <w:p>
@@ -3664,7 +3552,7 @@
         <w:drawing>
           <wp:inline xmlns:a="http://schemas.openxmlformats.org/drawingml/2006/main" xmlns:pic="http://schemas.openxmlformats.org/drawingml/2006/picture">
             <wp:extent cx="5029200" cy="1985063"/>
-            <wp:docPr id="2" name="Picture 2"/>
+            <wp:docPr id="1" name="Picture 1"/>
             <wp:cNvGraphicFramePr>
               <a:graphicFrameLocks noChangeAspect="1"/>
             </wp:cNvGraphicFramePr>
@@ -3676,7 +3564,7 @@
                     <pic:cNvPicPr/>
                   </pic:nvPicPr>
                   <pic:blipFill>
-                    <a:blip r:embed="rId10"/>
+                    <a:blip r:embed="rId9"/>
                     <a:stretch>
                       <a:fillRect/>
                     </a:stretch>
@@ -3710,70 +3598,6 @@
     </w:p>
     <w:p>
       <w:pPr>
-        <w:ind w:firstLine="420"/>
-      </w:pPr>
-      <w:r>
-        <w:rPr>
-          <w:rFonts w:ascii="宋体" w:hAnsi="宋体" w:eastAsia="宋体"/>
-          <w:sz w:val="24"/>
-        </w:rPr>
-        <w:t>从机制层面分析，Street 城市地图的障碍率通常低于 0.1，对数映射后 α 取值接近上界 1.8，启发项权重大幅提升，搜索方向性强，扩展节点数减少约 22%；而 WC3 魔兽地图障碍率较高（约 0.3–0.5），α 趋近下界 1.0，算法近似退化为标准 A*，加速效果受限。DAO 游戏地图障碍率居中，改善幅度也介于两者之间（快约 7.5%），三类地图的规律与理论预期高度吻合。值得注意的是，即使在 WC3 地图上加速效果最弱（快约 6.7%），改进 A* 的运行时间也未出现超过传统 A* 的情况，说明自适应权重机制在最坏情况下能够安全退化，不引入额外开销。图 5 进一步展示了扩展节点数随障碍率的变化趋势，直观验证了自适应权重的工作机制（见图 5）。</w:t>
-      </w:r>
-    </w:p>
-    <w:p>
-      <w:pPr>
-        <w:jc w:val="center"/>
-      </w:pPr>
-      <w:r>
-        <w:drawing>
-          <wp:inline xmlns:a="http://schemas.openxmlformats.org/drawingml/2006/main" xmlns:pic="http://schemas.openxmlformats.org/drawingml/2006/picture">
-            <wp:extent cx="5029200" cy="5235297"/>
-            <wp:docPr id="3" name="Picture 3"/>
-            <wp:cNvGraphicFramePr>
-              <a:graphicFrameLocks noChangeAspect="1"/>
-            </wp:cNvGraphicFramePr>
-            <a:graphic>
-              <a:graphicData uri="http://schemas.openxmlformats.org/drawingml/2006/picture">
-                <pic:pic>
-                  <pic:nvPicPr>
-                    <pic:cNvPr id="0" name="fig5_nodes_vs_obstacle_v3.png"/>
-                    <pic:cNvPicPr/>
-                  </pic:nvPicPr>
-                  <pic:blipFill>
-                    <a:blip r:embed="rId11"/>
-                    <a:stretch>
-                      <a:fillRect/>
-                    </a:stretch>
-                  </pic:blipFill>
-                  <pic:spPr>
-                    <a:xfrm>
-                      <a:off x="0" y="0"/>
-                      <a:ext cx="5029200" cy="5235297"/>
-                    </a:xfrm>
-                    <a:prstGeom prst="rect"/>
-                  </pic:spPr>
-                </pic:pic>
-              </a:graphicData>
-            </a:graphic>
-          </wp:inline>
-        </w:drawing>
-      </w:r>
-    </w:p>
-    <w:p>
-      <w:pPr>
-        <w:spacing w:after="160"/>
-        <w:jc w:val="center"/>
-      </w:pPr>
-      <w:r>
-        <w:rPr>
-          <w:rFonts w:ascii="宋体" w:hAnsi="宋体" w:eastAsia="宋体"/>
-          <w:sz w:val="20"/>
-        </w:rPr>
-        <w:t>图 5  扩展节点数随障碍率的变化趋势</w:t>
-      </w:r>
-    </w:p>
-    <w:p>
-      <w:pPr>
         <w:pStyle w:val="Heading3"/>
       </w:pPr>
       <w:r>
@@ -3789,19 +3613,7 @@
           <w:rFonts w:ascii="宋体" w:hAnsi="宋体" w:eastAsia="宋体"/>
           <w:sz w:val="24"/>
         </w:rPr>
-        <w:t>改进 A* 在全部 15 张地图上均实现了路径长度的缩短，全局平均缩短约 4.9%（从 6.1624 降至 5.8635，绝对减少 0.299）。三类地图的改善幅度高度一致（DAO 5.0%、Street 4.8%、WC3 4.8%），说明路径长度的改善具有跨场景的稳定性。</w:t>
-      </w:r>
-    </w:p>
-    <w:p>
-      <w:pPr>
-        <w:ind w:firstLine="420"/>
-      </w:pPr>
-      <w:r>
-        <w:rPr>
-          <w:rFonts w:ascii="宋体" w:hAnsi="宋体" w:eastAsia="宋体"/>
-          <w:sz w:val="24"/>
-        </w:rPr>
-        <w:t>路径长度的改善主要来源于两阶段平滑中的视线简化阶段：删除冗余中间点后，路径不再沿栅格对角线迂回，而是走更直接的折线，从而在欧氏意义上缩短了总长度。这一改善与地图类型关系不大，因此在三类地图上表现出高度一致的改善幅度（4.8%–5.0%）。</w:t>
+        <w:t>改进 A* 在全部 15 张地图上均实现了路径长度的缩短，全局平均缩短约 4.9%（从 6.1624 降至 5.8635，绝对减少 0.299）。值得注意的是，三类地图的改善幅度高度一致（DAO 5.0%、Street 4.8%、WC3 4.8%）。这一一致性源于路径长度的改善主要来自视线简化阶段——删除冗余中间点后路径不再沿栅格对角线迂回，而是走更直接的折线，从而在欧氏意义上缩短了总长度。这一机制与地图类型关系不大，因此跨场景表现稳定。</w:t>
       </w:r>
     </w:p>
     <w:p>
@@ -3821,7 +3633,7 @@
           <w:rFonts w:ascii="宋体" w:hAnsi="宋体" w:eastAsia="宋体"/>
           <w:sz w:val="24"/>
         </w:rPr>
-        <w:t>转弯次数的改善是本文算法最为突出的优势。</w:t>
+        <w:t>转弯次数的减少是改进算法在路径质量上最直接的体现。</w:t>
       </w:r>
     </w:p>
     <w:tbl>
@@ -4222,7 +4034,7 @@
           <w:rFonts w:ascii="宋体" w:hAnsi="宋体" w:eastAsia="宋体"/>
           <w:sz w:val="24"/>
         </w:rPr>
-        <w:t>近零转弯的路径可以显著减少机器人的方向变换次数，降低运动学代价和机械磨损（见图 2）。</w:t>
+        <w:t>转弯次数接近零意味着路径几乎为直线段拼接，机器人无需频繁变向，运动学代价和机械磨损均可降低（见图 2）。Street 地图的减少比例最高（99.4%），这与城市街道结构的规则性有关——规则网格中冗余拐点更多，视线简化的删除空间更大。图 4 以 6 张代表性地图为例，直观展示了两种算法的路径差异。</w:t>
       </w:r>
     </w:p>
     <w:p>
@@ -4233,7 +4045,7 @@
         <w:drawing>
           <wp:inline xmlns:a="http://schemas.openxmlformats.org/drawingml/2006/main" xmlns:pic="http://schemas.openxmlformats.org/drawingml/2006/picture">
             <wp:extent cx="5029200" cy="2382607"/>
-            <wp:docPr id="4" name="Picture 4"/>
+            <wp:docPr id="2" name="Picture 2"/>
             <wp:cNvGraphicFramePr>
               <a:graphicFrameLocks noChangeAspect="1"/>
             </wp:cNvGraphicFramePr>
@@ -4245,7 +4057,7 @@
                     <pic:cNvPicPr/>
                   </pic:nvPicPr>
                   <pic:blipFill>
-                    <a:blip r:embed="rId12"/>
+                    <a:blip r:embed="rId10"/>
                     <a:stretch>
                       <a:fillRect/>
                     </a:stretch>
@@ -4787,7 +4599,7 @@
           <w:rFonts w:ascii="宋体" w:hAnsi="宋体" w:eastAsia="宋体"/>
           <w:sz w:val="24"/>
         </w:rPr>
-        <w:t>结论一：自适应权重是运行时间改善的主要来源。 去掉自适应权重后，运行时间增加约 8.1%，扩展节点数增加约 7.6%，而路径质量几乎不受影响。值得注意的是，消融组（无自适应权重，固定 \alpha=1.0）的转弯次数（0.0244）略低于完整模型（0.0267），这是由于 \alpha=1.0 时搜索更为保守，路径回溯结果与自适应权重略有差异，经同一路径平滑策略处理后出现微小波动；两者均接近零，差异在统计上不显著（p&gt;0.05）。</w:t>
+        <w:t>消融结果揭示了两个模块各自的作用边界。</w:t>
       </w:r>
     </w:p>
     <w:p>
@@ -4799,7 +4611,7 @@
           <w:rFonts w:ascii="宋体" w:hAnsi="宋体" w:eastAsia="宋体"/>
           <w:sz w:val="24"/>
         </w:rPr>
-        <w:t>结论二：路径平滑是路径质量改善的主要来源。 去掉路径平滑后，转弯次数从 0.027 次回升至 0.991 次（接近传统 A* 的 1.131 次），路径长度也恢复至与传统 A* 相同水平。</w:t>
+        <w:t>去掉自适应权重后（固定 \alpha=1.0），运行时间增加约 8.1%，扩展节点数增加约 7.6%，但路径长度和转弯次数几乎不变。这说明自适应权重的作用集中在搜索阶段，不影响路径后处理的效果。消融组的转弯次数（0.0244）略低于完整模型（0.0267），原因在于 \alpha=1.0 时搜索更保守，回溯路径略有不同，经同一平滑策略处理后产生微小波动；两者均接近零，差异在统计上不显著（p&gt;0.05）。</w:t>
       </w:r>
     </w:p>
     <w:p>
@@ -4811,7 +4623,19 @@
           <w:rFonts w:ascii="宋体" w:hAnsi="宋体" w:eastAsia="宋体"/>
           <w:sz w:val="24"/>
         </w:rPr>
-        <w:t>两个模块的贡献是正交的：自适应权重主要影响搜索效率，路径平滑主要影响路径质量，两者协同作用才能同时在速度和质量两个维度上取得改进（见图 3）。</w:t>
+        <w:t>去掉路径平滑后，转弯次数从 0.027 次回升至 0.991 次，路径长度恢复至与传统 A* 相同水平（6.1624）。路径质量的改善几乎完全依赖于平滑模块。</w:t>
+      </w:r>
+    </w:p>
+    <w:p>
+      <w:pPr>
+        <w:ind w:firstLine="420"/>
+      </w:pPr>
+      <w:r>
+        <w:rPr>
+          <w:rFonts w:ascii="宋体" w:hAnsi="宋体" w:eastAsia="宋体"/>
+          <w:sz w:val="24"/>
+        </w:rPr>
+        <w:t>两个模块的贡献可视为正交：自适应权重负责搜索加速，路径平滑负责质量改善，缺一不可（见图 3）。</w:t>
       </w:r>
     </w:p>
     <w:p>
@@ -4822,7 +4646,7 @@
         <w:drawing>
           <wp:inline xmlns:a="http://schemas.openxmlformats.org/drawingml/2006/main" xmlns:pic="http://schemas.openxmlformats.org/drawingml/2006/picture">
             <wp:extent cx="5029200" cy="4022015"/>
-            <wp:docPr id="5" name="Picture 5"/>
+            <wp:docPr id="3" name="Picture 3"/>
             <wp:cNvGraphicFramePr>
               <a:graphicFrameLocks noChangeAspect="1"/>
             </wp:cNvGraphicFramePr>
@@ -4834,7 +4658,7 @@
                     <pic:cNvPicPr/>
                   </pic:nvPicPr>
                   <pic:blipFill>
-                    <a:blip r:embed="rId13"/>
+                    <a:blip r:embed="rId11"/>
                     <a:stretch>
                       <a:fillRect/>
                     </a:stretch>
@@ -4883,7 +4707,7 @@
           <w:rFonts w:ascii="宋体" w:hAnsi="宋体" w:eastAsia="宋体"/>
           <w:sz w:val="24"/>
         </w:rPr>
-        <w:t>关于运行时间改善的差异性。 Street 地图的障碍率较低，自适应权重 \alpha 取值较高（约 1.4–1.8），搜索偏向性强，加速效果显著；WC3 地图障碍率较高，\alpha 趋近于下界 1.0，算法退化为标准 A*，加速效果有限。这一现象与本文的理论预期吻合。</w:t>
+        <w:t>运行时间的改善幅度在三类地图之间存在明显差异，这与自适应权重的映射机制直接相关。Street 地图障碍率通常低于 0.1，对数映射后 \alpha 接近上界 1.8，启发项权重大，搜索方向性强；WC3 地图障碍率多在 0.3–0.5 之间，\alpha 趋近下界 1.0，搜索行为接近标准 A*，加速效果随之减弱。DAO 地图居于两者之间。三类地图的梯度恰好覆盖了 \alpha 的整个取值区间，与 3.4 节的设计预期一致。</w:t>
       </w:r>
     </w:p>
     <w:p>
@@ -4895,7 +4719,7 @@
           <w:rFonts w:ascii="宋体" w:hAnsi="宋体" w:eastAsia="宋体"/>
           <w:sz w:val="24"/>
         </w:rPr>
-        <w:t>关于算法的适用场景与局限性。 本文算法适用于静态已知地图、8 邻域栅格、离线规划场景。在动态障碍物场景下，算法需要配合重规划机制。路径平滑策略基于离散栅格坐标的加权平均，生成的路径仍为折线而非连续曲线，对于需要曲率连续轨迹的高速机器人平台，可能需要进一步结合样条曲线拟合。</w:t>
+        <w:t>本文算法的适用边界也值得说明。算法假设地图静态且已知，不适用于动态障碍物场景；若需应对动态环境，须配合 D* Lite 等增量式重规划机制。路径平滑基于离散栅格坐标的加权平均，输出仍为折线而非连续曲线。对于高速机器人平台所需的曲率连续轨迹，可考虑在平滑后再接入样条拟合模块。</w:t>
       </w:r>
     </w:p>
     <w:p>
@@ -4907,7 +4731,7 @@
           <w:rFonts w:ascii="宋体" w:hAnsi="宋体" w:eastAsia="宋体"/>
           <w:sz w:val="24"/>
         </w:rPr>
-        <w:t>关于实验的可重复性。 本文所有实验均采用 Moving AI Lab 官方 .scen 文件指定的固定起终点任务，实验脚本和数据文件已在仓库中公开，可在相同环境下完整复现。</w:t>
+        <w:t>实验可重复性方面，本文全部测试采用 Moving AI Lab 官方 .scen 文件指定固定起终点，实验脚本和结果数据已在代码仓库公开（code/experiments/、results/），可在相同环境下完整复现。</w:t>
       </w:r>
     </w:p>
     <w:p>
@@ -4919,7 +4743,7 @@
           <w:rFonts w:ascii="宋体" w:hAnsi="宋体" w:eastAsia="宋体"/>
           <w:sz w:val="24"/>
         </w:rPr>
-        <w:t>关于与现有工作的性能比较。 本文 12.7% 的运行时间改善幅度低于部分文献报告的数值（如尧尹柱等[8]报告的 84.33%），这一差异源于实验条件的本质不同：尧尹柱等使用 50×50 的小规模栅格地图，而本文使用 Moving AI Lab 真实地图（规模从 256×256 到 1024×1024 不等），地图规模越大，算法间的相对差距越趋于收敛；此外，本文采用 strict scen 固定任务文件，避免了随机起终点带来的结果波动。因此，不同研究间的直接数值比较需结合实验条件审慎解读。</w:t>
+        <w:t>需要指出的是，本文 12.7% 的运行时间改善幅度低于部分文献报告的数值。例如尧尹柱等[8]在 50×50 小规模栅格地图上报告了 84.33% 的改善。这一差距主要源于实验条件不同：地图规模越大，算法间的相对差距越趋于收敛；本文使用的 Moving AI Lab 真实地图规模从 256×256 到 1024×1024 不等，且采用 strict scen 固定任务，避免了随机起终点带来的方差。不同研究间的直接数值比较需结合实验口径审慎解读。</w:t>
       </w:r>
     </w:p>
     <w:p>
@@ -4959,7 +4783,186 @@
           <w:rFonts w:ascii="宋体" w:hAnsi="宋体" w:eastAsia="宋体"/>
           <w:sz w:val="24"/>
         </w:rPr>
-        <w:t>在 Moving AI Lab 标准基准地图集的 15 张真实地图上的实验结果表明，改进 A* 算法在运行时间上平均比传统 A* 快 12.7%（运行时间比值 0.8728x），路径长度平均缩短 4.9%（绝对减少 0.299），转弯次数平均减少 97.6%（从 1.131 次降至 0.027 次），且 15 张地图全部呈正向改进，无退化案例。消融实验验证了自适应权重（运行时间改善来源）与路径平滑（路径质量改善来源）的正交贡献。</w:t>
+        <w:t>在 Moving AI Lab 标准基准地图集的 15 张真实地图上的实验结果表明：</w:t>
+      </w:r>
+    </w:p>
+    <w:tbl>
+      <w:tblPr>
+        <w:tblStyle w:val="TableGrid"/>
+        <w:tblW w:type="auto" w:w="0"/>
+        <w:jc w:val="center"/>
+        <w:tblLook w:firstColumn="1" w:firstRow="1" w:lastColumn="0" w:lastRow="0" w:noHBand="0" w:noVBand="1" w:val="04A0"/>
+      </w:tblPr>
+      <w:tblGrid>
+        <w:gridCol w:w="4536"/>
+        <w:gridCol w:w="4536"/>
+      </w:tblGrid>
+      <w:tr>
+        <w:tc>
+          <w:tcPr>
+            <w:tcW w:type="dxa" w:w="4536"/>
+          </w:tcPr>
+          <w:p>
+            <w:pPr>
+              <w:jc w:val="center"/>
+            </w:pPr>
+            <w:r/>
+            <w:r>
+              <w:rPr>
+                <w:rFonts w:ascii="宋体" w:hAnsi="宋体" w:eastAsia="宋体"/>
+                <w:b/>
+                <w:sz w:val="20"/>
+              </w:rPr>
+              <w:t>指标</w:t>
+            </w:r>
+          </w:p>
+        </w:tc>
+        <w:tc>
+          <w:tcPr>
+            <w:tcW w:type="dxa" w:w="4536"/>
+          </w:tcPr>
+          <w:p>
+            <w:pPr>
+              <w:jc w:val="center"/>
+            </w:pPr>
+            <w:r/>
+            <w:r>
+              <w:rPr>
+                <w:rFonts w:ascii="宋体" w:hAnsi="宋体" w:eastAsia="宋体"/>
+                <w:b/>
+                <w:sz w:val="20"/>
+              </w:rPr>
+              <w:t>改进 A* vs 传统 A*</w:t>
+            </w:r>
+          </w:p>
+        </w:tc>
+      </w:tr>
+      <w:tr>
+        <w:tc>
+          <w:tcPr>
+            <w:tcW w:type="dxa" w:w="4536"/>
+          </w:tcPr>
+          <w:p>
+            <w:pPr>
+              <w:jc w:val="center"/>
+            </w:pPr>
+            <w:r/>
+            <w:r>
+              <w:rPr>
+                <w:rFonts w:ascii="宋体" w:hAnsi="宋体" w:eastAsia="宋体"/>
+                <w:sz w:val="20"/>
+              </w:rPr>
+              <w:t>运行时间</w:t>
+            </w:r>
+          </w:p>
+        </w:tc>
+        <w:tc>
+          <w:tcPr>
+            <w:tcW w:type="dxa" w:w="4536"/>
+          </w:tcPr>
+          <w:p>
+            <w:pPr>
+              <w:jc w:val="center"/>
+            </w:pPr>
+            <w:r/>
+            <w:r>
+              <w:rPr>
+                <w:rFonts w:ascii="宋体" w:hAnsi="宋体" w:eastAsia="宋体"/>
+                <w:sz w:val="20"/>
+              </w:rPr>
+              <w:t>平均快 12.7%（比值 0.8728x）</w:t>
+            </w:r>
+          </w:p>
+        </w:tc>
+      </w:tr>
+      <w:tr>
+        <w:tc>
+          <w:tcPr>
+            <w:tcW w:type="dxa" w:w="4536"/>
+          </w:tcPr>
+          <w:p>
+            <w:pPr>
+              <w:jc w:val="center"/>
+            </w:pPr>
+            <w:r/>
+            <w:r>
+              <w:rPr>
+                <w:rFonts w:ascii="宋体" w:hAnsi="宋体" w:eastAsia="宋体"/>
+                <w:sz w:val="20"/>
+              </w:rPr>
+              <w:t>路径长度</w:t>
+            </w:r>
+          </w:p>
+        </w:tc>
+        <w:tc>
+          <w:tcPr>
+            <w:tcW w:type="dxa" w:w="4536"/>
+          </w:tcPr>
+          <w:p>
+            <w:pPr>
+              <w:jc w:val="center"/>
+            </w:pPr>
+            <w:r/>
+            <w:r>
+              <w:rPr>
+                <w:rFonts w:ascii="宋体" w:hAnsi="宋体" w:eastAsia="宋体"/>
+                <w:sz w:val="20"/>
+              </w:rPr>
+              <w:t>平均缩短 4.9%（绝对减少 0.299）</w:t>
+            </w:r>
+          </w:p>
+        </w:tc>
+      </w:tr>
+      <w:tr>
+        <w:tc>
+          <w:tcPr>
+            <w:tcW w:type="dxa" w:w="4536"/>
+          </w:tcPr>
+          <w:p>
+            <w:pPr>
+              <w:jc w:val="center"/>
+            </w:pPr>
+            <w:r/>
+            <w:r>
+              <w:rPr>
+                <w:rFonts w:ascii="宋体" w:hAnsi="宋体" w:eastAsia="宋体"/>
+                <w:sz w:val="20"/>
+              </w:rPr>
+              <w:t>转弯次数</w:t>
+            </w:r>
+          </w:p>
+        </w:tc>
+        <w:tc>
+          <w:tcPr>
+            <w:tcW w:type="dxa" w:w="4536"/>
+          </w:tcPr>
+          <w:p>
+            <w:pPr>
+              <w:jc w:val="center"/>
+            </w:pPr>
+            <w:r/>
+            <w:r>
+              <w:rPr>
+                <w:rFonts w:ascii="宋体" w:hAnsi="宋体" w:eastAsia="宋体"/>
+                <w:sz w:val="20"/>
+              </w:rPr>
+              <w:t>平均减少 97.6%（从 1.131 降至 0.027）</w:t>
+            </w:r>
+          </w:p>
+        </w:tc>
+      </w:tr>
+    </w:tbl>
+    <w:p/>
+    <w:p>
+      <w:pPr>
+        <w:ind w:firstLine="420"/>
+      </w:pPr>
+      <w:r>
+        <w:rPr>
+          <w:rFonts w:ascii="宋体" w:hAnsi="宋体" w:eastAsia="宋体"/>
+          <w:sz w:val="24"/>
+        </w:rPr>
+        <w:t>消融实验验证了自适应权重（运行时间改善来源）与路径平滑（路径质量改善来源）的正交贡献。</w:t>
       </w:r>
     </w:p>
     <w:p>

</xml_diff>